<commit_message>
Вынесение entry-policy логики из main_*.cpp в sfml1_runtime_entry (logging lifetime, terminate handler, single-instance guard, working directory, user dialogs, build info) и устранение архитектурной бомбы через sfml1_stress_common
</commit_message>
<xml_diff>
--- a/docs/architecture/ein Verzeichnis, eine Kategorie, eine Logik.docx
+++ b/docs/architecture/ein Verzeichnis, eine Kategorie, eine Logik.docx
@@ -42,7 +42,7 @@
               <w:tl2br w:val="nil" w:sz="0" w:space="0" w:color="000000" tmln="20, 20, 20, 0, 0"/>
               <w:tr2bl w:val="nil" w:sz="0" w:space="0" w:color="000000" tmln="20, 20, 20, 0, 0"/>
             </w:tcBorders>
-            <w:tmTcPr id="1765143960" protected="0"/>
+            <w:tmTcPr id="1772410002" protected="0"/>
           </w:tcPr>
           <w:p>
             <w:pPr>
@@ -78,7 +78,7 @@
               <w:tl2br w:val="nil" w:sz="0" w:space="0" w:color="000000" tmln="20, 20, 20, 0, 0"/>
               <w:tr2bl w:val="nil" w:sz="0" w:space="0" w:color="000000" tmln="20, 20, 20, 0, 0"/>
             </w:tcBorders>
-            <w:tmTcPr id="1765143960" protected="0"/>
+            <w:tmTcPr id="1772410002" protected="0"/>
           </w:tcPr>
           <w:p>
             <w:pPr>
@@ -114,7 +114,7 @@
               <w:tl2br w:val="nil" w:sz="0" w:space="0" w:color="000000" tmln="20, 20, 20, 0, 0"/>
               <w:tr2bl w:val="nil" w:sz="0" w:space="0" w:color="000000" tmln="20, 20, 20, 0, 0"/>
             </w:tcBorders>
-            <w:tmTcPr id="1765143960" protected="0"/>
+            <w:tmTcPr id="1772410002" protected="0"/>
           </w:tcPr>
           <w:p>
             <w:pPr>
@@ -150,7 +150,7 @@
               <w:tl2br w:val="nil" w:sz="0" w:space="0" w:color="000000" tmln="20, 20, 20, 0, 0"/>
               <w:tr2bl w:val="nil" w:sz="0" w:space="0" w:color="000000" tmln="20, 20, 20, 0, 0"/>
             </w:tcBorders>
-            <w:tmTcPr id="1765143960" protected="0"/>
+            <w:tmTcPr id="1772410002" protected="0"/>
           </w:tcPr>
           <w:p>
             <w:pPr>
@@ -193,7 +193,7 @@
               <w:tl2br w:val="nil" w:sz="0" w:space="0" w:color="000000" tmln="20, 20, 20, 0, 0"/>
               <w:tr2bl w:val="nil" w:sz="0" w:space="0" w:color="000000" tmln="20, 20, 20, 0, 0"/>
             </w:tcBorders>
-            <w:tmTcPr id="1765143960" protected="0"/>
+            <w:tmTcPr id="1772410002" protected="0"/>
           </w:tcPr>
           <w:p>
             <w:pPr>
@@ -229,7 +229,7 @@
               <w:tl2br w:val="nil" w:sz="0" w:space="0" w:color="000000" tmln="20, 20, 20, 0, 0"/>
               <w:tr2bl w:val="nil" w:sz="0" w:space="0" w:color="000000" tmln="20, 20, 20, 0, 0"/>
             </w:tcBorders>
-            <w:tmTcPr id="1765143960" protected="0"/>
+            <w:tmTcPr id="1772410002" protected="0"/>
           </w:tcPr>
           <w:p>
             <w:pPr>
@@ -265,7 +265,7 @@
               <w:tl2br w:val="nil" w:sz="0" w:space="0" w:color="000000" tmln="20, 20, 20, 0, 0"/>
               <w:tr2bl w:val="nil" w:sz="0" w:space="0" w:color="000000" tmln="20, 20, 20, 0, 0"/>
             </w:tcBorders>
-            <w:tmTcPr id="1765143960" protected="0"/>
+            <w:tmTcPr id="1772410002" protected="0"/>
           </w:tcPr>
           <w:p>
             <w:pPr>
@@ -301,7 +301,7 @@
               <w:tl2br w:val="nil" w:sz="0" w:space="0" w:color="000000" tmln="20, 20, 20, 0, 0"/>
               <w:tr2bl w:val="nil" w:sz="0" w:space="0" w:color="000000" tmln="20, 20, 20, 0, 0"/>
             </w:tcBorders>
-            <w:tmTcPr id="1765143960" protected="0"/>
+            <w:tmTcPr id="1772410002" protected="0"/>
           </w:tcPr>
           <w:p>
             <w:pPr>
@@ -344,7 +344,7 @@
               <w:tl2br w:val="nil" w:sz="0" w:space="0" w:color="000000" tmln="20, 20, 20, 0, 0"/>
               <w:tr2bl w:val="nil" w:sz="0" w:space="0" w:color="000000" tmln="20, 20, 20, 0, 0"/>
             </w:tcBorders>
-            <w:tmTcPr id="1765143960" protected="0"/>
+            <w:tmTcPr id="1772410002" protected="0"/>
           </w:tcPr>
           <w:p>
             <w:pPr>
@@ -380,7 +380,7 @@
               <w:tl2br w:val="nil" w:sz="0" w:space="0" w:color="000000" tmln="20, 20, 20, 0, 0"/>
               <w:tr2bl w:val="nil" w:sz="0" w:space="0" w:color="000000" tmln="20, 20, 20, 0, 0"/>
             </w:tcBorders>
-            <w:tmTcPr id="1765143960" protected="0"/>
+            <w:tmTcPr id="1772410002" protected="0"/>
           </w:tcPr>
           <w:p>
             <w:pPr>
@@ -416,7 +416,7 @@
               <w:tl2br w:val="nil" w:sz="0" w:space="0" w:color="000000" tmln="20, 20, 20, 0, 0"/>
               <w:tr2bl w:val="nil" w:sz="0" w:space="0" w:color="000000" tmln="20, 20, 20, 0, 0"/>
             </w:tcBorders>
-            <w:tmTcPr id="1765143960" protected="0"/>
+            <w:tmTcPr id="1772410002" protected="0"/>
           </w:tcPr>
           <w:p>
             <w:pPr>
@@ -452,7 +452,7 @@
               <w:tl2br w:val="nil" w:sz="0" w:space="0" w:color="000000" tmln="20, 20, 20, 0, 0"/>
               <w:tr2bl w:val="nil" w:sz="0" w:space="0" w:color="000000" tmln="20, 20, 20, 0, 0"/>
             </w:tcBorders>
-            <w:tmTcPr id="1765143960" protected="0"/>
+            <w:tmTcPr id="1772410002" protected="0"/>
           </w:tcPr>
           <w:p>
             <w:pPr>
@@ -495,7 +495,7 @@
               <w:tl2br w:val="nil" w:sz="0" w:space="0" w:color="000000" tmln="20, 20, 20, 0, 0"/>
               <w:tr2bl w:val="nil" w:sz="0" w:space="0" w:color="000000" tmln="20, 20, 20, 0, 0"/>
             </w:tcBorders>
-            <w:tmTcPr id="1765143960" protected="0"/>
+            <w:tmTcPr id="1772410002" protected="0"/>
           </w:tcPr>
           <w:p>
             <w:pPr>
@@ -531,7 +531,7 @@
               <w:tl2br w:val="nil" w:sz="0" w:space="0" w:color="000000" tmln="20, 20, 20, 0, 0"/>
               <w:tr2bl w:val="nil" w:sz="0" w:space="0" w:color="000000" tmln="20, 20, 20, 0, 0"/>
             </w:tcBorders>
-            <w:tmTcPr id="1765143960" protected="0"/>
+            <w:tmTcPr id="1772410002" protected="0"/>
           </w:tcPr>
           <w:p>
             <w:pPr>
@@ -567,7 +567,7 @@
               <w:tl2br w:val="nil" w:sz="0" w:space="0" w:color="000000" tmln="20, 20, 20, 0, 0"/>
               <w:tr2bl w:val="nil" w:sz="0" w:space="0" w:color="000000" tmln="20, 20, 20, 0, 0"/>
             </w:tcBorders>
-            <w:tmTcPr id="1765143960" protected="0"/>
+            <w:tmTcPr id="1772410002" protected="0"/>
           </w:tcPr>
           <w:p>
             <w:pPr>
@@ -603,7 +603,7 @@
               <w:tl2br w:val="nil" w:sz="0" w:space="0" w:color="000000" tmln="20, 20, 20, 0, 0"/>
               <w:tr2bl w:val="nil" w:sz="0" w:space="0" w:color="000000" tmln="20, 20, 20, 0, 0"/>
             </w:tcBorders>
-            <w:tmTcPr id="1765143960" protected="0"/>
+            <w:tmTcPr id="1772410002" protected="0"/>
           </w:tcPr>
           <w:p>
             <w:pPr>
@@ -646,7 +646,7 @@
               <w:tl2br w:val="nil" w:sz="0" w:space="0" w:color="000000" tmln="20, 20, 20, 0, 0"/>
               <w:tr2bl w:val="nil" w:sz="0" w:space="0" w:color="000000" tmln="20, 20, 20, 0, 0"/>
             </w:tcBorders>
-            <w:tmTcPr id="1765143960" protected="0"/>
+            <w:tmTcPr id="1772410002" protected="0"/>
           </w:tcPr>
           <w:p>
             <w:pPr>
@@ -682,7 +682,7 @@
               <w:tl2br w:val="nil" w:sz="0" w:space="0" w:color="000000" tmln="20, 20, 20, 0, 0"/>
               <w:tr2bl w:val="nil" w:sz="0" w:space="0" w:color="000000" tmln="20, 20, 20, 0, 0"/>
             </w:tcBorders>
-            <w:tmTcPr id="1765143960" protected="0"/>
+            <w:tmTcPr id="1772410002" protected="0"/>
           </w:tcPr>
           <w:p>
             <w:pPr>
@@ -718,7 +718,7 @@
               <w:tl2br w:val="nil" w:sz="0" w:space="0" w:color="000000" tmln="20, 20, 20, 0, 0"/>
               <w:tr2bl w:val="nil" w:sz="0" w:space="0" w:color="000000" tmln="20, 20, 20, 0, 0"/>
             </w:tcBorders>
-            <w:tmTcPr id="1765143960" protected="0"/>
+            <w:tmTcPr id="1772410002" protected="0"/>
           </w:tcPr>
           <w:p>
             <w:pPr>
@@ -754,7 +754,7 @@
               <w:tl2br w:val="nil" w:sz="0" w:space="0" w:color="000000" tmln="20, 20, 20, 0, 0"/>
               <w:tr2bl w:val="nil" w:sz="0" w:space="0" w:color="000000" tmln="20, 20, 20, 0, 0"/>
             </w:tcBorders>
-            <w:tmTcPr id="1765143960" protected="0"/>
+            <w:tmTcPr id="1772410002" protected="0"/>
           </w:tcPr>
           <w:p>
             <w:pPr>
@@ -797,7 +797,7 @@
               <w:tl2br w:val="nil" w:sz="0" w:space="0" w:color="000000" tmln="20, 20, 20, 0, 0"/>
               <w:tr2bl w:val="nil" w:sz="0" w:space="0" w:color="000000" tmln="20, 20, 20, 0, 0"/>
             </w:tcBorders>
-            <w:tmTcPr id="1765143960" protected="0"/>
+            <w:tmTcPr id="1772410002" protected="0"/>
           </w:tcPr>
           <w:p>
             <w:pPr>
@@ -833,7 +833,7 @@
               <w:tl2br w:val="nil" w:sz="0" w:space="0" w:color="000000" tmln="20, 20, 20, 0, 0"/>
               <w:tr2bl w:val="nil" w:sz="0" w:space="0" w:color="000000" tmln="20, 20, 20, 0, 0"/>
             </w:tcBorders>
-            <w:tmTcPr id="1765143960" protected="0"/>
+            <w:tmTcPr id="1772410002" protected="0"/>
           </w:tcPr>
           <w:p>
             <w:pPr>
@@ -869,7 +869,7 @@
               <w:tl2br w:val="nil" w:sz="0" w:space="0" w:color="000000" tmln="20, 20, 20, 0, 0"/>
               <w:tr2bl w:val="nil" w:sz="0" w:space="0" w:color="000000" tmln="20, 20, 20, 0, 0"/>
             </w:tcBorders>
-            <w:tmTcPr id="1765143960" protected="0"/>
+            <w:tmTcPr id="1772410002" protected="0"/>
           </w:tcPr>
           <w:p>
             <w:pPr>
@@ -905,7 +905,7 @@
               <w:tl2br w:val="nil" w:sz="0" w:space="0" w:color="000000" tmln="20, 20, 20, 0, 0"/>
               <w:tr2bl w:val="nil" w:sz="0" w:space="0" w:color="000000" tmln="20, 20, 20, 0, 0"/>
             </w:tcBorders>
-            <w:tmTcPr id="1765143960" protected="0"/>
+            <w:tmTcPr id="1772410002" protected="0"/>
           </w:tcPr>
           <w:p>
             <w:pPr>
@@ -948,7 +948,7 @@
               <w:tl2br w:val="nil" w:sz="0" w:space="0" w:color="000000" tmln="20, 20, 20, 0, 0"/>
               <w:tr2bl w:val="nil" w:sz="0" w:space="0" w:color="000000" tmln="20, 20, 20, 0, 0"/>
             </w:tcBorders>
-            <w:tmTcPr id="1765143960" protected="0"/>
+            <w:tmTcPr id="1772410002" protected="0"/>
           </w:tcPr>
           <w:p>
             <w:pPr>
@@ -984,7 +984,7 @@
               <w:tl2br w:val="nil" w:sz="0" w:space="0" w:color="000000" tmln="20, 20, 20, 0, 0"/>
               <w:tr2bl w:val="nil" w:sz="0" w:space="0" w:color="000000" tmln="20, 20, 20, 0, 0"/>
             </w:tcBorders>
-            <w:tmTcPr id="1765143960" protected="0"/>
+            <w:tmTcPr id="1772410002" protected="0"/>
           </w:tcPr>
           <w:p>
             <w:pPr>
@@ -1020,7 +1020,7 @@
               <w:tl2br w:val="nil" w:sz="0" w:space="0" w:color="000000" tmln="20, 20, 20, 0, 0"/>
               <w:tr2bl w:val="nil" w:sz="0" w:space="0" w:color="000000" tmln="20, 20, 20, 0, 0"/>
             </w:tcBorders>
-            <w:tmTcPr id="1765143960" protected="0"/>
+            <w:tmTcPr id="1772410002" protected="0"/>
           </w:tcPr>
           <w:p>
             <w:pPr>
@@ -1056,7 +1056,7 @@
               <w:tl2br w:val="nil" w:sz="0" w:space="0" w:color="000000" tmln="20, 20, 20, 0, 0"/>
               <w:tr2bl w:val="nil" w:sz="0" w:space="0" w:color="000000" tmln="20, 20, 20, 0, 0"/>
             </w:tcBorders>
-            <w:tmTcPr id="1765143960" protected="0"/>
+            <w:tmTcPr id="1772410002" protected="0"/>
           </w:tcPr>
           <w:p>
             <w:pPr>
@@ -1099,7 +1099,7 @@
               <w:tl2br w:val="nil" w:sz="0" w:space="0" w:color="000000" tmln="20, 20, 20, 0, 0"/>
               <w:tr2bl w:val="nil" w:sz="0" w:space="0" w:color="000000" tmln="20, 20, 20, 0, 0"/>
             </w:tcBorders>
-            <w:tmTcPr id="1765143960" protected="0"/>
+            <w:tmTcPr id="1772410002" protected="0"/>
           </w:tcPr>
           <w:p>
             <w:pPr>
@@ -1135,7 +1135,7 @@
               <w:tl2br w:val="nil" w:sz="0" w:space="0" w:color="000000" tmln="20, 20, 20, 0, 0"/>
               <w:tr2bl w:val="nil" w:sz="0" w:space="0" w:color="000000" tmln="20, 20, 20, 0, 0"/>
             </w:tcBorders>
-            <w:tmTcPr id="1765143960" protected="0"/>
+            <w:tmTcPr id="1772410002" protected="0"/>
           </w:tcPr>
           <w:p>
             <w:pPr>
@@ -1171,7 +1171,7 @@
               <w:tl2br w:val="nil" w:sz="0" w:space="0" w:color="000000" tmln="20, 20, 20, 0, 0"/>
               <w:tr2bl w:val="nil" w:sz="0" w:space="0" w:color="000000" tmln="20, 20, 20, 0, 0"/>
             </w:tcBorders>
-            <w:tmTcPr id="1765143960" protected="0"/>
+            <w:tmTcPr id="1772410002" protected="0"/>
           </w:tcPr>
           <w:p>
             <w:pPr>
@@ -1207,7 +1207,7 @@
               <w:tl2br w:val="nil" w:sz="0" w:space="0" w:color="000000" tmln="20, 20, 20, 0, 0"/>
               <w:tr2bl w:val="nil" w:sz="0" w:space="0" w:color="000000" tmln="20, 20, 20, 0, 0"/>
             </w:tcBorders>
-            <w:tmTcPr id="1765143960" protected="0"/>
+            <w:tmTcPr id="1772410002" protected="0"/>
           </w:tcPr>
           <w:p>
             <w:pPr>
@@ -1250,7 +1250,7 @@
               <w:tl2br w:val="nil" w:sz="0" w:space="0" w:color="000000" tmln="20, 20, 20, 0, 0"/>
               <w:tr2bl w:val="nil" w:sz="0" w:space="0" w:color="000000" tmln="20, 20, 20, 0, 0"/>
             </w:tcBorders>
-            <w:tmTcPr id="1765143960" protected="0"/>
+            <w:tmTcPr id="1772410002" protected="0"/>
           </w:tcPr>
           <w:p>
             <w:pPr>
@@ -1286,7 +1286,7 @@
               <w:tl2br w:val="nil" w:sz="0" w:space="0" w:color="000000" tmln="20, 20, 20, 0, 0"/>
               <w:tr2bl w:val="nil" w:sz="0" w:space="0" w:color="000000" tmln="20, 20, 20, 0, 0"/>
             </w:tcBorders>
-            <w:tmTcPr id="1765143960" protected="0"/>
+            <w:tmTcPr id="1772410002" protected="0"/>
           </w:tcPr>
           <w:p>
             <w:pPr>
@@ -1322,7 +1322,7 @@
               <w:tl2br w:val="nil" w:sz="0" w:space="0" w:color="000000" tmln="20, 20, 20, 0, 0"/>
               <w:tr2bl w:val="nil" w:sz="0" w:space="0" w:color="000000" tmln="20, 20, 20, 0, 0"/>
             </w:tcBorders>
-            <w:tmTcPr id="1765143960" protected="0"/>
+            <w:tmTcPr id="1772410002" protected="0"/>
           </w:tcPr>
           <w:p>
             <w:pPr>
@@ -1358,7 +1358,7 @@
               <w:tl2br w:val="nil" w:sz="0" w:space="0" w:color="000000" tmln="20, 20, 20, 0, 0"/>
               <w:tr2bl w:val="nil" w:sz="0" w:space="0" w:color="000000" tmln="20, 20, 20, 0, 0"/>
             </w:tcBorders>
-            <w:tmTcPr id="1765143960" protected="0"/>
+            <w:tmTcPr id="1772410002" protected="0"/>
           </w:tcPr>
           <w:p>
             <w:pPr>
@@ -1401,7 +1401,7 @@
               <w:tl2br w:val="nil" w:sz="0" w:space="0" w:color="000000" tmln="20, 20, 20, 0, 0"/>
               <w:tr2bl w:val="nil" w:sz="0" w:space="0" w:color="000000" tmln="20, 20, 20, 0, 0"/>
             </w:tcBorders>
-            <w:tmTcPr id="1765143960" protected="0"/>
+            <w:tmTcPr id="1772410002" protected="0"/>
           </w:tcPr>
           <w:p>
             <w:pPr>
@@ -1437,7 +1437,7 @@
               <w:tl2br w:val="nil" w:sz="0" w:space="0" w:color="000000" tmln="20, 20, 20, 0, 0"/>
               <w:tr2bl w:val="nil" w:sz="0" w:space="0" w:color="000000" tmln="20, 20, 20, 0, 0"/>
             </w:tcBorders>
-            <w:tmTcPr id="1765143960" protected="0"/>
+            <w:tmTcPr id="1772410002" protected="0"/>
           </w:tcPr>
           <w:p>
             <w:pPr>
@@ -1473,7 +1473,7 @@
               <w:tl2br w:val="nil" w:sz="0" w:space="0" w:color="000000" tmln="20, 20, 20, 0, 0"/>
               <w:tr2bl w:val="nil" w:sz="0" w:space="0" w:color="000000" tmln="20, 20, 20, 0, 0"/>
             </w:tcBorders>
-            <w:tmTcPr id="1765143960" protected="0"/>
+            <w:tmTcPr id="1772410002" protected="0"/>
           </w:tcPr>
           <w:p>
             <w:pPr>
@@ -1509,7 +1509,7 @@
               <w:tl2br w:val="nil" w:sz="0" w:space="0" w:color="000000" tmln="20, 20, 20, 0, 0"/>
               <w:tr2bl w:val="nil" w:sz="0" w:space="0" w:color="000000" tmln="20, 20, 20, 0, 0"/>
             </w:tcBorders>
-            <w:tmTcPr id="1765143960" protected="0"/>
+            <w:tmTcPr id="1772410002" protected="0"/>
           </w:tcPr>
           <w:p>
             <w:pPr>
@@ -1552,7 +1552,7 @@
               <w:tl2br w:val="nil" w:sz="0" w:space="0" w:color="000000" tmln="20, 20, 20, 0, 0"/>
               <w:tr2bl w:val="nil" w:sz="0" w:space="0" w:color="000000" tmln="20, 20, 20, 0, 0"/>
             </w:tcBorders>
-            <w:tmTcPr id="1765143960" protected="0"/>
+            <w:tmTcPr id="1772410002" protected="0"/>
           </w:tcPr>
           <w:p>
             <w:pPr>
@@ -1588,7 +1588,7 @@
               <w:tl2br w:val="nil" w:sz="0" w:space="0" w:color="000000" tmln="20, 20, 20, 0, 0"/>
               <w:tr2bl w:val="nil" w:sz="0" w:space="0" w:color="000000" tmln="20, 20, 20, 0, 0"/>
             </w:tcBorders>
-            <w:tmTcPr id="1765143960" protected="0"/>
+            <w:tmTcPr id="1772410002" protected="0"/>
           </w:tcPr>
           <w:p>
             <w:pPr>
@@ -1624,7 +1624,7 @@
               <w:tl2br w:val="nil" w:sz="0" w:space="0" w:color="000000" tmln="20, 20, 20, 0, 0"/>
               <w:tr2bl w:val="nil" w:sz="0" w:space="0" w:color="000000" tmln="20, 20, 20, 0, 0"/>
             </w:tcBorders>
-            <w:tmTcPr id="1765143960" protected="0"/>
+            <w:tmTcPr id="1772410002" protected="0"/>
           </w:tcPr>
           <w:p>
             <w:pPr>
@@ -1660,7 +1660,7 @@
               <w:tl2br w:val="nil" w:sz="0" w:space="0" w:color="000000" tmln="20, 20, 20, 0, 0"/>
               <w:tr2bl w:val="nil" w:sz="0" w:space="0" w:color="000000" tmln="20, 20, 20, 0, 0"/>
             </w:tcBorders>
-            <w:tmTcPr id="1765143960" protected="0"/>
+            <w:tmTcPr id="1772410002" protected="0"/>
           </w:tcPr>
           <w:p>
             <w:pPr>
@@ -1703,7 +1703,7 @@
               <w:tl2br w:val="nil" w:sz="0" w:space="0" w:color="000000" tmln="20, 20, 20, 0, 0"/>
               <w:tr2bl w:val="nil" w:sz="0" w:space="0" w:color="000000" tmln="20, 20, 20, 0, 0"/>
             </w:tcBorders>
-            <w:tmTcPr id="1765143960" protected="0"/>
+            <w:tmTcPr id="1772410002" protected="0"/>
           </w:tcPr>
           <w:p>
             <w:pPr>
@@ -1739,7 +1739,7 @@
               <w:tl2br w:val="nil" w:sz="0" w:space="0" w:color="000000" tmln="20, 20, 20, 0, 0"/>
               <w:tr2bl w:val="nil" w:sz="0" w:space="0" w:color="000000" tmln="20, 20, 20, 0, 0"/>
             </w:tcBorders>
-            <w:tmTcPr id="1765143960" protected="0"/>
+            <w:tmTcPr id="1772410002" protected="0"/>
           </w:tcPr>
           <w:p>
             <w:pPr>
@@ -1775,7 +1775,7 @@
               <w:tl2br w:val="nil" w:sz="0" w:space="0" w:color="000000" tmln="20, 20, 20, 0, 0"/>
               <w:tr2bl w:val="nil" w:sz="0" w:space="0" w:color="000000" tmln="20, 20, 20, 0, 0"/>
             </w:tcBorders>
-            <w:tmTcPr id="1765143960" protected="0"/>
+            <w:tmTcPr id="1772410002" protected="0"/>
           </w:tcPr>
           <w:p>
             <w:pPr>
@@ -1811,7 +1811,7 @@
               <w:tl2br w:val="nil" w:sz="0" w:space="0" w:color="000000" tmln="20, 20, 20, 0, 0"/>
               <w:tr2bl w:val="nil" w:sz="0" w:space="0" w:color="000000" tmln="20, 20, 20, 0, 0"/>
             </w:tcBorders>
-            <w:tmTcPr id="1765143960" protected="0"/>
+            <w:tmTcPr id="1772410002" protected="0"/>
           </w:tcPr>
           <w:p>
             <w:pPr>
@@ -1854,7 +1854,7 @@
               <w:tl2br w:val="nil" w:sz="0" w:space="0" w:color="000000" tmln="20, 20, 20, 0, 0"/>
               <w:tr2bl w:val="nil" w:sz="0" w:space="0" w:color="000000" tmln="20, 20, 20, 0, 0"/>
             </w:tcBorders>
-            <w:tmTcPr id="1765143960" protected="0"/>
+            <w:tmTcPr id="1772410002" protected="0"/>
           </w:tcPr>
           <w:p>
             <w:pPr>
@@ -1890,7 +1890,7 @@
               <w:tl2br w:val="nil" w:sz="0" w:space="0" w:color="000000" tmln="20, 20, 20, 0, 0"/>
               <w:tr2bl w:val="nil" w:sz="0" w:space="0" w:color="000000" tmln="20, 20, 20, 0, 0"/>
             </w:tcBorders>
-            <w:tmTcPr id="1765143960" protected="0"/>
+            <w:tmTcPr id="1772410002" protected="0"/>
           </w:tcPr>
           <w:p>
             <w:pPr>
@@ -1926,7 +1926,7 @@
               <w:tl2br w:val="nil" w:sz="0" w:space="0" w:color="000000" tmln="20, 20, 20, 0, 0"/>
               <w:tr2bl w:val="nil" w:sz="0" w:space="0" w:color="000000" tmln="20, 20, 20, 0, 0"/>
             </w:tcBorders>
-            <w:tmTcPr id="1765143960" protected="0"/>
+            <w:tmTcPr id="1772410002" protected="0"/>
           </w:tcPr>
           <w:p>
             <w:pPr>
@@ -1962,7 +1962,7 @@
               <w:tl2br w:val="nil" w:sz="0" w:space="0" w:color="000000" tmln="20, 20, 20, 0, 0"/>
               <w:tr2bl w:val="nil" w:sz="0" w:space="0" w:color="000000" tmln="20, 20, 20, 0, 0"/>
             </w:tcBorders>
-            <w:tmTcPr id="1765143960" protected="0"/>
+            <w:tmTcPr id="1772410002" protected="0"/>
           </w:tcPr>
           <w:p>
             <w:pPr>
@@ -2005,79 +2005,61 @@
               <w:tl2br w:val="nil" w:sz="0" w:space="0" w:color="000000" tmln="20, 20, 20, 0, 0"/>
               <w:tr2bl w:val="nil" w:sz="0" w:space="0" w:color="000000" tmln="20, 20, 20, 0, 0"/>
             </w:tcBorders>
-            <w:tmTcPr id="1765143960" protected="0"/>
-          </w:tcPr>
-          <w:p>
-            <w:pPr>
-              <w:pBdr>
-                <w:top w:val="nil" w:sz="0" w:space="0" w:color="000000" tmln="20, 20, 20, 0, 0"/>
-                <w:left w:val="nil" w:sz="0" w:space="0" w:color="000000" tmln="20, 20, 20, 0, 0"/>
-                <w:bottom w:val="nil" w:sz="0" w:space="0" w:color="000000" tmln="20, 20, 20, 0, 0"/>
-                <w:right w:val="nil" w:sz="0" w:space="0" w:color="000000" tmln="20, 20, 20, 0, 0"/>
-                <w:between w:val="nil" w:sz="0" w:space="0" w:color="000000" tmln="20, 20, 20, 0, 0"/>
-              </w:pBdr>
-              <w:shd w:val="none"/>
-            </w:pPr>
-            <w:r>
-              <w:t>main_skyguard.cpp</w:t>
-            </w:r>
-          </w:p>
-        </w:tc>
-        <w:tc>
-          <w:tcPr>
-            <w:tcW w:w="2410" w:type="dxa"/>
-            <w:shd w:val="none"/>
-            <w:tcMar>
-              <w:top w:w="56" w:type="dxa"/>
-              <w:left w:w="56" w:type="dxa"/>
-              <w:bottom w:w="56" w:type="dxa"/>
-              <w:right w:w="56" w:type="dxa"/>
-            </w:tcMar>
-            <w:tcBorders>
-              <w:top w:val="nil" w:sz="0" w:space="0" w:color="000000" tmln="20, 20, 20, 0, 0"/>
-              <w:left w:val="nil" w:sz="0" w:space="0" w:color="000000" tmln="20, 20, 20, 0, 0"/>
-              <w:bottom w:val="nil" w:sz="0" w:space="0" w:color="000000" tmln="20, 20, 20, 0, 0"/>
-              <w:right w:val="nil" w:sz="0" w:space="0" w:color="000000" tmln="20, 20, 20, 0, 0"/>
-              <w:tl2br w:val="nil" w:sz="0" w:space="0" w:color="000000" tmln="20, 20, 20, 0, 0"/>
-              <w:tr2bl w:val="nil" w:sz="0" w:space="0" w:color="000000" tmln="20, 20, 20, 0, 0"/>
-            </w:tcBorders>
-            <w:tmTcPr id="1765143960" protected="0"/>
-          </w:tcPr>
-          <w:p>
-            <w:pPr>
-              <w:pBdr>
-                <w:top w:val="nil" w:sz="0" w:space="0" w:color="000000" tmln="20, 20, 20, 0, 0"/>
-                <w:left w:val="nil" w:sz="0" w:space="0" w:color="000000" tmln="20, 20, 20, 0, 0"/>
-                <w:bottom w:val="nil" w:sz="0" w:space="0" w:color="000000" tmln="20, 20, 20, 0, 0"/>
-                <w:right w:val="nil" w:sz="0" w:space="0" w:color="000000" tmln="20, 20, 20, 0, 0"/>
-                <w:between w:val="nil" w:sz="0" w:space="0" w:color="000000" tmln="20, 20, 20, 0, 0"/>
-              </w:pBdr>
-              <w:shd w:val="none"/>
-            </w:pPr>
-            <w:r>
-              <w:t>глобальный :: + core::...</w:t>
-            </w:r>
-          </w:p>
-        </w:tc>
-        <w:tc>
-          <w:tcPr>
-            <w:tcW w:w="2410" w:type="dxa"/>
-            <w:shd w:val="none"/>
-            <w:tcMar>
-              <w:top w:w="56" w:type="dxa"/>
-              <w:left w:w="56" w:type="dxa"/>
-              <w:bottom w:w="56" w:type="dxa"/>
-              <w:right w:w="56" w:type="dxa"/>
-            </w:tcMar>
-            <w:tcBorders>
-              <w:top w:val="nil" w:sz="0" w:space="0" w:color="000000" tmln="20, 20, 20, 0, 0"/>
-              <w:left w:val="nil" w:sz="0" w:space="0" w:color="000000" tmln="20, 20, 20, 0, 0"/>
-              <w:bottom w:val="nil" w:sz="0" w:space="0" w:color="000000" tmln="20, 20, 20, 0, 0"/>
-              <w:right w:val="nil" w:sz="0" w:space="0" w:color="000000" tmln="20, 20, 20, 0, 0"/>
-              <w:tl2br w:val="nil" w:sz="0" w:space="0" w:color="000000" tmln="20, 20, 20, 0, 0"/>
-              <w:tr2bl w:val="nil" w:sz="0" w:space="0" w:color="000000" tmln="20, 20, 20, 0, 0"/>
-            </w:tcBorders>
-            <w:tmTcPr id="1765143960" protected="0"/>
+            <w:tmTcPr id="1772410002" protected="0"/>
+          </w:tcPr>
+          <w:p>
+            <w:pPr/>
+            <w:r>
+              <w:t>core/runtime/entry/*</w:t>
+            </w:r>
+          </w:p>
+        </w:tc>
+        <w:tc>
+          <w:tcPr>
+            <w:tcW w:w="2410" w:type="dxa"/>
+            <w:shd w:val="none"/>
+            <w:tcMar>
+              <w:top w:w="56" w:type="dxa"/>
+              <w:left w:w="56" w:type="dxa"/>
+              <w:bottom w:w="56" w:type="dxa"/>
+              <w:right w:w="56" w:type="dxa"/>
+            </w:tcMar>
+            <w:tcBorders>
+              <w:top w:val="nil" w:sz="0" w:space="0" w:color="000000" tmln="20, 20, 20, 0, 0"/>
+              <w:left w:val="nil" w:sz="0" w:space="0" w:color="000000" tmln="20, 20, 20, 0, 0"/>
+              <w:bottom w:val="nil" w:sz="0" w:space="0" w:color="000000" tmln="20, 20, 20, 0, 0"/>
+              <w:right w:val="nil" w:sz="0" w:space="0" w:color="000000" tmln="20, 20, 20, 0, 0"/>
+              <w:tl2br w:val="nil" w:sz="0" w:space="0" w:color="000000" tmln="20, 20, 20, 0, 0"/>
+              <w:tr2bl w:val="nil" w:sz="0" w:space="0" w:color="000000" tmln="20, 20, 20, 0, 0"/>
+            </w:tcBorders>
+            <w:tmTcPr id="1772410002" protected="0"/>
+          </w:tcPr>
+          <w:p>
+            <w:pPr/>
+            <w:r>
+              <w:t>core::runtime::entry</w:t>
+            </w:r>
+          </w:p>
+        </w:tc>
+        <w:tc>
+          <w:tcPr>
+            <w:tcW w:w="2410" w:type="dxa"/>
+            <w:shd w:val="none"/>
+            <w:tcMar>
+              <w:top w:w="56" w:type="dxa"/>
+              <w:left w:w="56" w:type="dxa"/>
+              <w:bottom w:w="56" w:type="dxa"/>
+              <w:right w:w="56" w:type="dxa"/>
+            </w:tcMar>
+            <w:tcBorders>
+              <w:top w:val="nil" w:sz="0" w:space="0" w:color="000000" tmln="20, 20, 20, 0, 0"/>
+              <w:left w:val="nil" w:sz="0" w:space="0" w:color="000000" tmln="20, 20, 20, 0, 0"/>
+              <w:bottom w:val="nil" w:sz="0" w:space="0" w:color="000000" tmln="20, 20, 20, 0, 0"/>
+              <w:right w:val="nil" w:sz="0" w:space="0" w:color="000000" tmln="20, 20, 20, 0, 0"/>
+              <w:tl2br w:val="nil" w:sz="0" w:space="0" w:color="000000" tmln="20, 20, 20, 0, 0"/>
+              <w:tr2bl w:val="nil" w:sz="0" w:space="0" w:color="000000" tmln="20, 20, 20, 0, 0"/>
+            </w:tcBorders>
+            <w:tmTcPr id="1772410002" protected="0"/>
           </w:tcPr>
           <w:p>
             <w:pPr>
@@ -2113,21 +2095,12 @@
               <w:tl2br w:val="nil" w:sz="0" w:space="0" w:color="000000" tmln="20, 20, 20, 0, 0"/>
               <w:tr2bl w:val="nil" w:sz="0" w:space="0" w:color="000000" tmln="20, 20, 20, 0, 0"/>
             </w:tcBorders>
-            <w:tmTcPr id="1765143960" protected="0"/>
-          </w:tcPr>
-          <w:p>
-            <w:pPr>
-              <w:pBdr>
-                <w:top w:val="nil" w:sz="0" w:space="0" w:color="000000" tmln="20, 20, 20, 0, 0"/>
-                <w:left w:val="nil" w:sz="0" w:space="0" w:color="000000" tmln="20, 20, 20, 0, 0"/>
-                <w:bottom w:val="nil" w:sz="0" w:space="0" w:color="000000" tmln="20, 20, 20, 0, 0"/>
-                <w:right w:val="nil" w:sz="0" w:space="0" w:color="000000" tmln="20, 20, 20, 0, 0"/>
-                <w:between w:val="nil" w:sz="0" w:space="0" w:color="000000" tmln="20, 20, 20, 0, 0"/>
-              </w:pBdr>
-              <w:shd w:val="none"/>
-            </w:pPr>
-            <w:r>
-              <w:t>Bootstrapping: logging, single-instance guard, panic-обработка.</w:t>
+            <w:tmTcPr id="1772410002" protected="0"/>
+          </w:tcPr>
+          <w:p>
+            <w:pPr/>
+            <w:r>
+              <w:t>Bootstrapping-политики: logging lifetime, terminate, single-instance, working dir, dialogs.</w:t>
             </w:r>
           </w:p>
         </w:tc>

</xml_diff>